<commit_message>
Convert Hasbara plan to individual (solo) voice: singular feminine, single submitter
Co-Authored-By: Claude <noreply@anthropic.com>
</commit_message>
<xml_diff>
--- a/תוכנית דוברות והסברה.docx
+++ b/תוכנית דוברות והסברה.docx
@@ -172,7 +172,7 @@
           <w:szCs w:val="26"/>
           <w:rtl w:val="1"/>
         </w:rPr>
-        <w:t>מגישות: ___________________</w:t>
+        <w:t>מגישה: ___________________</w:t>
       </w:r>
     </w:p>
     <w:p>
@@ -249,7 +249,7 @@
           <w:szCs w:val="24"/>
           <w:rtl w:val="1"/>
         </w:rPr>
-        <w:t>בחרנו לבנות תוכנית דוברות והסברה עבור עמותת "מרחב", עמותה שפועלת בנגב עם ילדים ובני נוער במצבי סיכון. העמותה מפעילה מרכזי יום, ליווי אישי ותוכניות מניעה לנשירה, לאלימות ולהתמכרויות, ומגיעה מדי שנה למאות בני נוער. בשטח היא חזקה, אבל בזירה הציבורית היא כמעט שקופה. מעט אנשים מכירים אותה, התקציב שלה תלוי בתרומות ונע בין שנה לשנה, והמונח "נוער בסיכון" עצמו נושא סטיגמה שמקשה על גיוס תמיכה. מכאן צמחה התוכנית הזאת, שבנויה על שלושה רבדים שנלמדו בקורס, הרובד האסטרטגי, הרובד הטקטי במסלול יחסי הציבור, וההיערכות לניהול משבר קטגורי.</w:t>
+        <w:t>בחרתי לבנות תוכנית דוברות והסברה עבור עמותת "מרחב", עמותה שפועלת בנגב עם ילדים ובני נוער במצבי סיכון. העמותה מפעילה מרכזי יום, ליווי אישי ותוכניות מניעה לנשירה, לאלימות ולהתמכרויות, ומגיעה מדי שנה למאות בני נוער. בשטח היא חזקה, אבל בזירה הציבורית היא כמעט שקופה. מעט אנשים מכירים אותה, התקציב שלה תלוי בתרומות ונע בין שנה לשנה, והמונח "נוער בסיכון" עצמו נושא סטיגמה שמקשה על גיוס תמיכה. מכאן צמחה התוכנית הזאת, שבנויה על שלושה רבדים שנלמדו בקורס, הרובד האסטרטגי, הרובד הטקטי במסלול יחסי הציבור, וההיערכות לניהול משבר קטגורי.</w:t>
       </w:r>
     </w:p>
     <w:p>
@@ -308,7 +308,7 @@
           <w:szCs w:val="24"/>
           <w:rtl w:val="1"/>
         </w:rPr>
-        <w:t>העובדות ראשית. לעמותת מרחב יש עשור של עבודה, צוות מקצועי, ותוצאות מוכחות בשטח, ירידה בנשירה ובמעורבות בעבריינות בקרב מי שהשתתפו בתוכניות. לצד זה, המודעות הציבורית אליה נמוכה, הנוכחות הדיגיטלית שלה דלה, ומרבית התקציב מגיע ממספר קטן של תורמים, מה שהופך אותה לפגיעה. העמדות בשטח מפוצלות. יש אהדה לילדים, אבל יש גם חשד וסטיגמה כלפי "נוער בסיכון", שנתפס לא פעם כאיום ולא כמי שזקוק להזדמנות. זו נקודת המוצא שממנה אנחנו יוצאות.</w:t>
+        <w:t>העובדות ראשית. לעמותת מרחב יש עשור של עבודה, צוות מקצועי, ותוצאות מוכחות בשטח, ירידה בנשירה ובמעורבות בעבריינות בקרב מי שהשתתפו בתוכניות. לצד זה, המודעות הציבורית אליה נמוכה, הנוכחות הדיגיטלית שלה דלה, ומרבית התקציב מגיע ממספר קטן של תורמים, מה שהופך אותה לפגיעה. העמדות בשטח מפוצלות. יש אהדה לילדים, אבל יש גם חשד וסטיגמה כלפי "נוער בסיכון", שנתפס לא פעם כאיום ולא כמי שזקוק להזדמנות. זו נקודת המוצא שממנה אני יוצאת.</w:t>
       </w:r>
     </w:p>
     <w:p>
@@ -344,7 +344,7 @@
           <w:szCs w:val="24"/>
           <w:rtl w:val="1"/>
         </w:rPr>
-        <w:t>המטרה שהצבנו איננה סתם "יותר חשיפה". אנחנו רוצות לעשות שני דברים שקשורים זה בזה, לחזק את האמון והמוניטין של העמותה כדי להרחיב את מעגל התורמים, ובמקביל למסגר מחדש את המושג "נוער בסיכון", מאיום שמפחדים ממנו לנוער עם פוטנציאל שכדאי להשקיע בו. בלי שינוי התפיסה הזה, כל קמפיין גיוס ייתקל בקיר.</w:t>
+        <w:t>המטרה שהצבתי איננה סתם "יותר חשיפה". אני רוצה לעשות שני דברים שקשורים זה בזה, לחזק את האמון והמוניטין של העמותה כדי להרחיב את מעגל התורמים, ובמקביל למסגר מחדש את המושג "נוער בסיכון", מאיום שמפחדים ממנו לנוער עם פוטנציאל שכדאי להשקיע בו. בלי שינוי התפיסה הזה, כל קמפיין גיוס ייתקל בקיר.</w:t>
       </w:r>
     </w:p>
     <w:p>
@@ -416,7 +416,7 @@
           <w:szCs w:val="24"/>
           <w:rtl w:val="1"/>
         </w:rPr>
-        <w:t>בחרנו לקבע את התוכנית סביב פתיחת שנת הלימודים בספטמבר. זה היום הקובע. זו התקופה שבה נושא הנוער חוזר לכותרות, שבה הורים ומורים ערניים לנשירה, ושבה קל יותר לחבר בין הסיפור של מרחב לבין מה שמעסיק את הציבור. בניית התוכנית לאורך ציר הזמן הזה נותנת לה נקודת שיא טבעית ולא מלאכותית.</w:t>
+        <w:t>בחרתי לקבע את התוכנית סביב פתיחת שנת הלימודים בספטמבר. זה היום הקובע. זו התקופה שבה נושא הנוער חוזר לכותרות, שבה הורים ומורים ערניים לנשירה, ושבה קל יותר לחבר בין הסיפור של מרחב לבין מה שמעסיק את הציבור. בניית התוכנית לאורך ציר הזמן הזה נותנת לה נקודת שיא טבעית ולא מלאכותית.</w:t>
       </w:r>
     </w:p>
     <w:p>
@@ -452,7 +452,7 @@
           <w:szCs w:val="24"/>
           <w:rtl w:val="1"/>
         </w:rPr>
-        <w:t>מצאנו שלושה מעגלים. הראשון הוא בעלי הברית, משרד הרווחה והרשויות המקומיות, תורמים קיימים, בוגרי התוכנית שהם השגרירים האמינים ביותר, ומשפיענים וכלי תקשורת שאכפת להם מהנושא. השני הוא גורמי הסיכון, קולות ביקורתיים כלפי התנהלות עמותות בכלל, וסטיגמות חברתיות שמזינות התנגדות. השלישי הוא הציבור הרחב, שעדיין לא גיבש עמדה וזה בדיוק הקהל שאפשר להזיז. מיפוי כזה קובע במי משקיעים ומול מי נערכים.</w:t>
+        <w:t>מצאתי שלושה מעגלים. הראשון הוא בעלי הברית, משרד הרווחה והרשויות המקומיות, תורמים קיימים, בוגרי התוכנית שהם השגרירים האמינים ביותר, ומשפיענים וכלי תקשורת שאכפת להם מהנושא. השני הוא גורמי הסיכון, קולות ביקורתיים כלפי התנהלות עמותות בכלל, וסטיגמות חברתיות שמזינות התנגדות. השלישי הוא הציבור הרחב, שעדיין לא גיבש עמדה וזה בדיוק הקהל שאפשר להזיז. מיפוי כזה קובע במי משקיעים ומול מי נערכים.</w:t>
       </w:r>
     </w:p>
     <w:p>
@@ -524,7 +524,7 @@
           <w:szCs w:val="24"/>
           <w:rtl w:val="1"/>
         </w:rPr>
-        <w:t>הבחירה למקם את הקהל במרכז ולנהל איתו דיאלוג ולא רק להעביר אליו מסר נשענת גם על מה שנלמד. מחקר שבחן עמותות לילדים ונוער בסיכון מצא שהצלחתן ברשתות תלויה ביכולת לאזן בין הרצון להרחיב חשיפה לבין שמירה על ערכים, על אתיקה ועל הקשר האישי עם הקהל, וזה בדיוק המתח שהתוכנית שלנו מנסה לנהל (עלוש-גלם ואחרים, 2025).</w:t>
+        <w:t>הבחירה למקם את הקהל במרכז ולנהל איתו דיאלוג ולא רק להעביר אליו מסר נשענת גם על מה שנלמד. מחקר שבחן עמותות לילדים ונוער בסיכון מצא שהצלחתן ברשתות תלויה ביכולת לאזן בין הרצון להרחיב חשיפה לבין שמירה על ערכים, על אתיקה ועל הקשר האישי עם הקהל, וזה בדיוק המתח שהתוכנית שלי מנסה לנהל (עלוש-גלם ואחרים, 2025).</w:t>
       </w:r>
     </w:p>
     <w:p>
@@ -565,7 +565,7 @@
           <w:szCs w:val="24"/>
           <w:rtl w:val="1"/>
         </w:rPr>
-        <w:t>את האסטרטגיה תרגמנו לארבע יוזמות יחסי ציבור, שתיים במדיה הדיגיטלית ושתיים במדיה המסורתית. כל אחת מתוארת כאן בהרחבה, עם המטרה, הקהל, והדרך שבה היא מגישה את מסרי העוגן.</w:t>
+        <w:t>את האסטרטגיה תרגמתי לארבע יוזמות יחסי ציבור, שתיים במדיה הדיגיטלית ושתיים במדיה המסורתית. כל אחת מתוארת כאן בהרחבה, עם המטרה, הקהל, והדרך שבה היא מגישה את מסרי העוגן.</w:t>
       </w:r>
     </w:p>
     <w:p>
@@ -601,7 +601,7 @@
           <w:szCs w:val="24"/>
           <w:rtl w:val="1"/>
         </w:rPr>
-        <w:t>הלב של הזירה הדיגיטלית הוא סדרת סרטונים קצרים, דקה כל אחד, של בוגרי העמותה. כל סרטון מספר סיפור אישי אחד, מהרגע הקשה ועד להווה, ונחתם באותו משפט, מישהו האמין בי. הסרטונים מופצים באינסטגרם, בטיקטוק ובפייסבוק לאורך חודש ספטמבר, עם האשטאג אחיד וקריאה ברורה לפעולה, לשתף ולתרום. אנחנו משלבות גם משפיענים שהנושא קרוב לליבם, כדי להרחיב את ההגעה מעבר לעוקבים של העמותה. היוזמה הזאת מגישה את המסר האמוציונלי במלואו, ופונה לציבור הרחב ולתורמים הפרטיים.</w:t>
+        <w:t>הלב של הזירה הדיגיטלית הוא סדרת סרטונים קצרים, דקה כל אחד, של בוגרי העמותה. כל סרטון מספר סיפור אישי אחד, מהרגע הקשה ועד להווה, ונחתם באותו משפט, מישהו האמין בי. הסרטונים מופצים באינסטגרם, בטיקטוק ובפייסבוק לאורך חודש ספטמבר, עם האשטאג אחיד וקריאה ברורה לפעולה, לשתף ולתרום. אני משלבת גם משפיענים שהנושא קרוב לליבם, כדי להרחיב את ההגעה מעבר לעוקבים של העמותה. היוזמה הזאת מגישה את המסר האמוציונלי במלואו, ופונה לציבור הרחב ולתורמים הפרטיים.</w:t>
       </w:r>
     </w:p>
     <w:p>
@@ -637,7 +637,7 @@
           <w:szCs w:val="24"/>
           <w:rtl w:val="1"/>
         </w:rPr>
-        <w:t>היוזמה השנייה עונה על צורך אחר, אמון. פתחנו באתר ובעמודים החברתיים ערוץ שקוף שנקרא יומן שטח, שבו העמותה מפרסמת מדי שבוע הצצה אמיתית לעבודה, ולצידו דוח השפעה אינטראקטיבי שמראה לאן הולך כל שקל ומה הוא משנה. התורמים מוזמנים לשאול, להגיב ולקבל מענה ישיר, כך שהתקשורת היא דו-כיוונית ולא רק הכרזה. הבחירה בגישה הדיאלוגית והשקופה הזאת נשענת על ממצא שלפיו דווקא השקיפות והקשב לקהל הם שמבססים את האמון בעמותות שפועלות עם אוכלוסיות רגישות (עלוש-גלם ואחרים, 2025).</w:t>
+        <w:t>היוזמה השנייה עונה על צורך אחר, אמון. פתחתי באתר ובעמודים החברתיים ערוץ שקוף שנקרא יומן שטח, שבו העמותה מפרסמת מדי שבוע הצצה אמיתית לעבודה, ולצידו דוח השפעה אינטראקטיבי שמראה לאן הולך כל שקל ומה הוא משנה. התורמים מוזמנים לשאול, להגיב ולקבל מענה ישיר, כך שהתקשורת היא דו-כיוונית ולא רק הכרזה. הבחירה בגישה הדיאלוגית והשקופה הזאת נשענת על ממצא שלפיו דווקא השקיפות והקשב לקהל הם שמבססים את האמון בעמותות שפועלות עם אוכלוסיות רגישות (עלוש-גלם ואחרים, 2025).</w:t>
       </w:r>
     </w:p>
     <w:p>
@@ -673,7 +673,7 @@
           <w:szCs w:val="24"/>
           <w:rtl w:val="1"/>
         </w:rPr>
-        <w:t>במדיה המסורתית פתחנו בהודעה לעיתונות שמתוזמנת לפתיחת שנת הלימודים, ומגובה בכתבת עומק או ריאיון בכלי תקשורת ארצי ומקומי. ההודעה משלבת את שני המסרים, הנתונים על החיסכון והתועלת לצד סיפור אישי של בוגר, ומציעה לעיתונאים זווית מוכנה, אנושית ומגובה בעובדות. המטרה כאן היא להגיע למקבלי ההחלטות ולתורמים העסקיים, שנחשפים דווקא לערוצים האלה, ולמצב את מרחב כמקור סמכות מקצועי בתחום.</w:t>
+        <w:t>במדיה המסורתית פתחתי בהודעה לעיתונות שמתוזמנת לפתיחת שנת הלימודים, ומגובה בכתבת עומק או ריאיון בכלי תקשורת ארצי ומקומי. ההודעה משלבת את שני המסרים, הנתונים על החיסכון והתועלת לצד סיפור אישי של בוגר, ומציעה לעיתונאים זווית מוכנה, אנושית ומגובה בעובדות. המטרה כאן היא להגיע למקבלי ההחלטות ולתורמים העסקיים, שנחשפים דווקא לערוצים האלה, ולמצב את מרחב כמקור סמכות מקצועי בתחום.</w:t>
       </w:r>
     </w:p>
     <w:p>
@@ -709,7 +709,7 @@
           <w:szCs w:val="24"/>
           <w:rtl w:val="1"/>
         </w:rPr>
-        <w:t>היוזמה הרביעית היא אירוע ציבורי בפתיחת השנה, מעין מפגש עיתונאים שהוא גם השקה של היעד השנתי. על הבמה יעמדו יחד נציג רשות, איש מקצוע מהעמותה, ובוגר שיספר את סיפורו. האירוע מייצר תמונה תקשורתית חזקה, מחבר בין השחקנים המשפיעים שמיפינו, ונותן לכלי התקשורת אירוע חי לסקר. הוא גם מאותת לתורמים שמרחב היא שחקן רציני עם גב ציבורי, ולא עמותה קטנה ובודדה.</w:t>
+        <w:t>היוזמה הרביעית היא אירוע ציבורי בפתיחת השנה, מעין מפגש עיתונאים שהוא גם השקה של היעד השנתי. על הבמה יעמדו יחד נציג רשות, איש מקצוע מהעמותה, ובוגר שיספר את סיפורו. האירוע מייצר תמונה תקשורתית חזקה, מחבר בין השחקנים המשפיעים שמיפיתי, ונותן לכלי התקשורת אירוע חי לסקר. הוא גם מאותת לתורמים שמרחב היא שחקן רציני עם גב ציבורי, ולא עמותה קטנה ובודדה.</w:t>
       </w:r>
     </w:p>
     <w:p>
@@ -750,7 +750,7 @@
           <w:szCs w:val="24"/>
           <w:rtl w:val="1"/>
         </w:rPr>
-        <w:t>לעמותה שעובדת עם קטינים במצבי סיכון יש משבר קטגורי אחד שצריך להיערך אליו מראש, פגיעה באמון בעקבות אירוע חמור שמערב חניך. התרחיש שאנחנו נערכות אליו הוא פרסום על מקרה של פגיעה, הזנחה או כשל פיקוח באחת המסגרות, שמתפוצץ בתקשורת וברשתות. משבר כזה מאיים ישירות על הנכס היקר ביותר של העמותה, האמון של הציבור ושל התורמים.</w:t>
+        <w:t>לעמותה שעובדת עם קטינים במצבי סיכון יש משבר קטגורי אחד שצריך להיערך אליו מראש, פגיעה באמון בעקבות אירוע חמור שמערב חניך. התרחיש שאני נערכת אליו הוא פרסום על מקרה של פגיעה, הזנחה או כשל פיקוח באחת המסגרות, שמתפוצץ בתקשורת וברשתות. משבר כזה מאיים ישירות על הנכס היקר ביותר של העמותה, האמון של הציבור ושל התורמים.</w:t>
       </w:r>
     </w:p>
     <w:p>
@@ -768,7 +768,7 @@
           <w:szCs w:val="24"/>
           <w:rtl w:val="1"/>
         </w:rPr>
-        <w:t>ההיערכות מתחילה הרבה לפני המשבר. הקמנו צוות משבר קבוע וקבענו דובר יחיד ומוסמך, כדי שלא ייצאו מהעמותה קולות סותרים. הכנו מראש הצהרת החזקה, כמה משפטים ראשונים שמבטאים אחריות, אמפתיה ומחויבות לבדיקה, שאפשר לפרסם בתוך דקות. הגדרנו מי מנטר את הרשתות ואת התקשורת מסביב לשעון, ומיפינו מראש תרחישים אפשריים עם תגובה מדורגת לכל אחד. ההיערכות המוקדמת הזאת היא ההבדל בין תגובה שקולה לבין גמגום מול מצלמה.</w:t>
+        <w:t>ההיערכות מתחילה הרבה לפני המשבר. הקמתי צוות משבר קבוע וקבעתי דובר יחיד ומוסמך, כדי שלא ייצאו מהעמותה קולות סותרים. הכנתי מראש הצהרת החזקה, כמה משפטים ראשונים שמבטאים אחריות, אמפתיה ומחויבות לבדיקה, שאפשר לפרסם בתוך דקות. הגדרתי מי מנטר את הרשתות ואת התקשורת מסביב לשעון, ומיפיתי מראש תרחישים אפשריים עם תגובה מדורגת לכל אחד. ההיערכות המוקדמת הזאת היא ההבדל בין תגובה שקולה לבין גמגום מול מצלמה.</w:t>
       </w:r>
     </w:p>
     <w:p>
@@ -786,7 +786,7 @@
           <w:szCs w:val="24"/>
           <w:rtl w:val="1"/>
         </w:rPr>
-        <w:t>הכלים המקצועיים שבחרנו נשענים על מה שמחקר עדכני מזהה כליבה של תקשורת משבר אפקטיבית. סקירה מקיפה של המחקר בתחום מצאה שהאמון בתקשורת בזמן משבר תלוי בעיקר בארבעה מאפיינים, שקיפות, מהירות תגובה, אמפתיה ובהירות, ושהרשתות החברתיות הפכו לזירה המרכזית שבה משבר מתפוצץ ומנוהל (Upadhyay &amp; Upadhyay, 2023).</w:t>
+        <w:t>הכלים המקצועיים שבחרתי נשענים על מה שמחקר עדכני מזהה כליבה של תקשורת משבר אפקטיבית. סקירה מקיפה של המחקר בתחום מצאה שהאמון בתקשורת בזמן משבר תלוי בעיקר בארבעה מאפיינים, שקיפות, מהירות תגובה, אמפתיה ובהירות, ושהרשתות החברתיות הפכו לזירה המרכזית שבה משבר מתפוצץ ומנוהל (Upadhyay &amp; Upadhyay, 2023).</w:t>
       </w:r>
     </w:p>
     <w:p>
@@ -822,7 +822,7 @@
           <w:szCs w:val="24"/>
           <w:rtl w:val="1"/>
         </w:rPr>
-        <w:t>אחרי שהסערה שוככת מגיע השלב שקל לשכוח, שיקום התדמית. כאן העמותה מראה מה למדה ומה שינתה, מפרסמת את המסקנות ואת הצעדים המתקנים, וחוזרת לספר את הסיפור החיובי שלה דרך אותם ערוצים דיגיטליים ומסורתיים שבנינו. משבר מנוהל היטב יכול אפילו לחזק את האמון, אם הציבור רואה ארגון שלוקח אחריות ולא מתחמק (Upadhyay &amp; Upadhyay, 2023).</w:t>
+        <w:t>אחרי שהסערה שוככת מגיע השלב שקל לשכוח, שיקום התדמית. כאן העמותה מראה מה למדה ומה שינתה, מפרסמת את המסקנות ואת הצעדים המתקנים, וחוזרת לספר את הסיפור החיובי שלה דרך אותם ערוצים דיגיטליים ומסורתיים שבניתי. משבר מנוהל היטב יכול אפילו לחזק את האמון, אם הציבור רואה ארגון שלוקח אחריות ולא מתחמק (Upadhyay &amp; Upadhyay, 2023).</w:t>
       </w:r>
     </w:p>
     <w:p>

</xml_diff>

<commit_message>
Use official Ono Academic College logo on Hasbara cover
Co-Authored-By: Claude <noreply@anthropic.com>
</commit_message>
<xml_diff>
--- a/תוכנית דוברות והסברה.docx
+++ b/תוכנית דוברות והסברה.docx
@@ -17,7 +17,7 @@
       <w:r>
         <w:drawing>
           <wp:inline xmlns:a="http://schemas.openxmlformats.org/drawingml/2006/main" xmlns:pic="http://schemas.openxmlformats.org/drawingml/2006/picture">
-            <wp:extent cx="1737360" cy="1737360"/>
+            <wp:extent cx="2377440" cy="1166909"/>
             <wp:docPr id="1" name="Picture 1"/>
             <wp:cNvGraphicFramePr>
               <a:graphicFrameLocks noChangeAspect="1"/>
@@ -26,7 +26,7 @@
               <a:graphicData uri="http://schemas.openxmlformats.org/drawingml/2006/picture">
                 <pic:pic>
                   <pic:nvPicPr>
-                    <pic:cNvPr id="0" name="960e2fb4-IMG_7818.jpeg"/>
+                    <pic:cNvPr id="0" name="40093ad3-IMG_5776.png"/>
                     <pic:cNvPicPr/>
                   </pic:nvPicPr>
                   <pic:blipFill>
@@ -38,7 +38,7 @@
                   <pic:spPr>
                     <a:xfrm>
                       <a:off x="0" y="0"/>
-                      <a:ext cx="1737360" cy="1737360"/>
+                      <a:ext cx="2377440" cy="1166909"/>
                     </a:xfrm>
                     <a:prstGeom prst="rect"/>
                   </pic:spPr>

</xml_diff>

<commit_message>
Correct citations against source PDFs: real Hebrew author names (Alosh Glam/Avidar/Magen); accurately represent Upadhyay bibliometric review (not a 'four trust traits' finding)
Co-Authored-By: Claude <noreply@anthropic.com>
</commit_message>
<xml_diff>
--- a/תוכנית דוברות והסברה.docx
+++ b/תוכנית דוברות והסברה.docx
@@ -524,7 +524,7 @@
           <w:szCs w:val="24"/>
           <w:rtl w:val="1"/>
         </w:rPr>
-        <w:t>הבחירה למקם את הקהל במרכז ולנהל איתו דיאלוג ולא רק להעביר אליו מסר נשענת גם על מה שנלמד. מחקר שבחן עמותות לילדים ונוער בסיכון מצא שהצלחתן ברשתות תלויה ביכולת לאזן בין הרצון להרחיב חשיפה לבין שמירה על ערכים, על אתיקה ועל הקשר האישי עם הקהל, וזה בדיוק המתח שהתוכנית שלי מנסה לנהל (עלוש-גלם ואחרים, 2025).</w:t>
+        <w:t>הבחירה למקם את הקהל במרכז ולנהל איתו דיאלוג ולא רק להעביר אליו מסר נשענת גם על מה שנלמד. מחקר שבחן עמותות לילדים ונוער בסיכון מצא שהצלחתן ברשתות תלויה ביכולת לאזן בין הרצון להרחיב חשיפה לבין שמירה על ערכים, על אתיקה ועל הקשר האישי עם הקהל, וזה בדיוק המתח שהתוכנית שלי מנסה לנהל (אלוש גלם ואחרים, 2025).</w:t>
       </w:r>
     </w:p>
     <w:p>
@@ -637,7 +637,7 @@
           <w:szCs w:val="24"/>
           <w:rtl w:val="1"/>
         </w:rPr>
-        <w:t>היוזמה השנייה עונה על צורך אחר, אמון. פתחתי באתר ובעמודים החברתיים ערוץ שקוף שנקרא יומן שטח, שבו העמותה מפרסמת מדי שבוע הצצה אמיתית לעבודה, ולצידו דוח השפעה אינטראקטיבי שמראה לאן הולך כל שקל ומה הוא משנה. התורמים מוזמנים לשאול, להגיב ולקבל מענה ישיר, כך שהתקשורת היא דו-כיוונית ולא רק הכרזה. הבחירה בגישה הדיאלוגית והשקופה הזאת נשענת על ממצא שלפיו דווקא השקיפות והקשב לקהל הם שמבססים את האמון בעמותות שפועלות עם אוכלוסיות רגישות (עלוש-גלם ואחרים, 2025).</w:t>
+        <w:t>היוזמה השנייה עונה על צורך אחר, אמון. פתחתי באתר ובעמודים החברתיים ערוץ שקוף שנקרא יומן שטח, שבו העמותה מפרסמת מדי שבוע הצצה אמיתית לעבודה, ולצידו דוח השפעה אינטראקטיבי שמראה לאן הולך כל שקל ומה הוא משנה. התורמים מוזמנים לשאול, להגיב ולקבל מענה ישיר, כך שהתקשורת היא דו-כיוונית ולא רק הכרזה. הבחירה בגישה הדיאלוגית והשקופה הזאת נשענת על ממצא שלפיו דווקא השקיפות והקשב לקהל הם שמבססים את האמון בעמותות שפועלות עם אוכלוסיות רגישות (אלוש גלם ואחרים, 2025).</w:t>
       </w:r>
     </w:p>
     <w:p>
@@ -786,7 +786,7 @@
           <w:szCs w:val="24"/>
           <w:rtl w:val="1"/>
         </w:rPr>
-        <w:t>הכלים המקצועיים שבחרתי נשענים על מה שמחקר עדכני מזהה כליבה של תקשורת משבר אפקטיבית. סקירה מקיפה של המחקר בתחום מצאה שהאמון בתקשורת בזמן משבר תלוי בעיקר בארבעה מאפיינים, שקיפות, מהירות תגובה, אמפתיה ובהירות, ושהרשתות החברתיות הפכו לזירה המרכזית שבה משבר מתפוצץ ומנוהל (Upadhyay &amp; Upadhyay, 2023).</w:t>
+        <w:t>הכלים המקצועיים שבחרתי נשענים על מה שמזוהה בספרות כליבה של תקשורת משבר. סקירה ביבליומטרית מקיפה שמיפתה כחמישה עשורים של מחקר בתחום מצאה שאחת התמות המרכזיות היא הקשר בין תקשורת משבר לרשתות החברתיות, לצד תמות של מנהיגות בעת משבר ושל בנייה וניהול של מוניטין, ושהרשתות הפכו לזירה שבה משברים מתפרצים ומנוהלים כיום (Upadhyay &amp; Upadhyay, 2023).</w:t>
       </w:r>
     </w:p>
     <w:p>
@@ -804,7 +804,7 @@
           <w:szCs w:val="24"/>
           <w:rtl w:val="1"/>
         </w:rPr>
-        <w:t>לכן התגובה של מרחב תהיה מהירה, כנה, ומנוסחת בשפה אנושית, ולא בהתגוננות משפטית קרה. הדובר יאמר את מה שידוע, יכיר ברגש, ויתחייב לבדוק, במקום לחכות שהתמונה תתבהר בזמן שהרשתות כבר רותחות.</w:t>
+        <w:t>על בסיס זה בניתי את עקרונות התגובה של מרחב, מהירות, שקיפות, אמפתיה ובהירות. התגובה תהיה מנוסחת בשפה אנושית ולא בהתגוננות משפטית קרה. הדובר יאמר את מה שידוע, יכיר ברגש, ויתחייב לבדוק, במקום לחכות שהתמונה תתבהר בזמן שהרשתות כבר רותחות.</w:t>
       </w:r>
     </w:p>
     <w:p>
@@ -822,7 +822,25 @@
           <w:szCs w:val="24"/>
           <w:rtl w:val="1"/>
         </w:rPr>
-        <w:t>אחרי שהסערה שוככת מגיע השלב שקל לשכוח, שיקום התדמית. כאן העמותה מראה מה למדה ומה שינתה, מפרסמת את המסקנות ואת הצעדים המתקנים, וחוזרת לספר את הסיפור החיובי שלה דרך אותם ערוצים דיגיטליים ומסורתיים שבניתי. משבר מנוהל היטב יכול אפילו לחזק את האמון, אם הציבור רואה ארגון שלוקח אחריות ולא מתחמק (Upadhyay &amp; Upadhyay, 2023).</w:t>
+        <w:t>אחרי שהסערה שוככת מגיע השלב שקל לשכוח, שיקום התדמית. בניית מוניטין וניהולו הם אחד הצירים המרכזיים שהמחקר בתחום מזהה בתקשורת המשבר (Upadhyay &amp; Upadhyay, 2023).</w:t>
+      </w:r>
+    </w:p>
+    <w:p>
+      <w:pPr>
+        <w:bidi w:val="1"/>
+        <w:spacing w:line="360" w:lineRule="auto" w:after="160"/>
+        <w:jc w:val="both"/>
+      </w:pPr>
+      <w:r>
+        <w:rPr>
+          <w:rFonts w:ascii="David" w:hAnsi="David" w:cs="David"/>
+          <w:b w:val="0"/>
+          <w:i w:val="0"/>
+          <w:sz w:val="24"/>
+          <w:szCs w:val="24"/>
+          <w:rtl w:val="1"/>
+        </w:rPr>
+        <w:t>כאן העמותה מראה מה למדה ומה שינתה, מפרסמת את המסקנות ואת הצעדים המתקנים, וחוזרת לספר את הסיפור החיובי שלה דרך אותם ערוצים דיגיטליים ומסורתיים שבניתי. משבר מנוהל היטב יכול אפילו לחזק את האמון, אם הציבור רואה ארגון שלוקח אחריות ולא מתחמק.</w:t>
       </w:r>
     </w:p>
     <w:p>
@@ -905,7 +923,7 @@
           <w:szCs w:val="24"/>
           <w:rtl w:val="1"/>
         </w:rPr>
-        <w:t xml:space="preserve">עלוש-גלם, א', אבידר, ר', ומגן, י' (2025). דילמות דיגיטליות של עמותות לילדים ונוער בסיכון בהפעלת עקרונות דיאלוגיים. </w:t>
+        <w:t xml:space="preserve">אלוש גלם, ר', אבידר, ר', ומגן, כ' (2025). דילמות דיגיטליות של עמותות לילדים ונוער בסיכון בהפעלת עקרונות דיאלוגיים. </w:t>
       </w:r>
       <w:r>
         <w:rPr>

</xml_diff>

<commit_message>
Expand Hasbara plan and add three peer-reviewed OA sources (Oliński & Szamrowski 2021; MacKay et al. 2021; DeMasters et al. 2024)
Co-Authored-By: Claude <noreply@anthropic.com>
</commit_message>
<xml_diff>
--- a/תוכנית דוברות והסברה.docx
+++ b/תוכנית דוברות והסברה.docx
@@ -607,6 +607,24 @@
     <w:p>
       <w:pPr>
         <w:bidi w:val="1"/>
+        <w:spacing w:line="360" w:lineRule="auto" w:after="160"/>
+        <w:jc w:val="both"/>
+      </w:pPr>
+      <w:r>
+        <w:rPr>
+          <w:rFonts w:ascii="David" w:hAnsi="David" w:cs="David"/>
+          <w:b w:val="0"/>
+          <w:i w:val="0"/>
+          <w:sz w:val="24"/>
+          <w:szCs w:val="24"/>
+          <w:rtl w:val="1"/>
+        </w:rPr>
+        <w:t>הבחירה בסיפור אישי וגולמי ולא במסר מלוטש איננה מקרית. מחקר שבחן מעורבות של עמותות בפלטפורמות כמו טיקטוק מצא שדווקא תוכן אותנטי ואישי, שמותאם לשפה של הפלטפורמה ולא משוכפל ממנה, הוא שמייצר חיבור אמיתי עם הקהל ומעורבות גבוהה יותר (DeMasters et al., 2024).</w:t>
+      </w:r>
+    </w:p>
+    <w:p>
+      <w:pPr>
+        <w:bidi w:val="1"/>
         <w:spacing w:line="360" w:lineRule="auto" w:after="120"/>
         <w:jc w:val="right"/>
       </w:pPr>
@@ -638,6 +656,24 @@
           <w:rtl w:val="1"/>
         </w:rPr>
         <w:t>היוזמה השנייה עונה על צורך אחר, אמון. פתחתי באתר ובעמודים החברתיים ערוץ שקוף שנקרא יומן שטח, שבו העמותה מפרסמת מדי שבוע הצצה אמיתית לעבודה, ולצידו דוח השפעה אינטראקטיבי שמראה לאן הולך כל שקל ומה הוא משנה. התורמים מוזמנים לשאול, להגיב ולקבל מענה ישיר, כך שהתקשורת היא דו-כיוונית ולא רק הכרזה. הבחירה בגישה הדיאלוגית והשקופה הזאת נשענת על ממצא שלפיו דווקא השקיפות והקשב לקהל הם שמבססים את האמון בעמותות שפועלות עם אוכלוסיות רגישות (אלוש גלם ואחרים, 2025).</w:t>
+      </w:r>
+    </w:p>
+    <w:p>
+      <w:pPr>
+        <w:bidi w:val="1"/>
+        <w:spacing w:line="360" w:lineRule="auto" w:after="160"/>
+        <w:jc w:val="both"/>
+      </w:pPr>
+      <w:r>
+        <w:rPr>
+          <w:rFonts w:ascii="David" w:hAnsi="David" w:cs="David"/>
+          <w:b w:val="0"/>
+          <w:i w:val="0"/>
+          <w:sz w:val="24"/>
+          <w:szCs w:val="24"/>
+          <w:rtl w:val="1"/>
+        </w:rPr>
+        <w:t>יומן השטח הוא גם כלי לבניית מערכת יחסים, לא רק להעברת מידע. מחקר שבחן כיצד ארגונים ללא מטרות רווח משתמשים בפייסבוק מצא שהערך האמיתי של הנוכחות הדיגיטלית נמדד ביכולת לבנות קשר דו-כיווני ומתמשך עם הקהל, ולא במספר הפרסומים או הלייקים (Oliński &amp; Szamrowski, 2021).</w:t>
       </w:r>
     </w:p>
     <w:p>
@@ -804,7 +840,25 @@
           <w:szCs w:val="24"/>
           <w:rtl w:val="1"/>
         </w:rPr>
-        <w:t>על בסיס זה בניתי את עקרונות התגובה של מרחב, מהירות, שקיפות, אמפתיה ובהירות. התגובה תהיה מנוסחת בשפה אנושית ולא בהתגוננות משפטית קרה. הדובר יאמר את מה שידוע, יכיר ברגש, ויתחייב לבדוק, במקום לחכות שהתמונה תתבהר בזמן שהרשתות כבר רותחות.</w:t>
+        <w:t>מחקר ממוקד יותר על תקשורת משבר ברשתות מצא שהאמון של הציבור בזמן משבר מושפע מארבעה מאפיינים של התקשורת, שקיפות, מהירות, אמפתיה ובהירות, ושהמשבר מתנהל בזירה רטורית שבה הארגון, כלי התקשורת והציבור מייצרים יחד את המסרים ומגיבים זה לזה (MacKay et al., 2021).</w:t>
+      </w:r>
+    </w:p>
+    <w:p>
+      <w:pPr>
+        <w:bidi w:val="1"/>
+        <w:spacing w:line="360" w:lineRule="auto" w:after="160"/>
+        <w:jc w:val="both"/>
+      </w:pPr>
+      <w:r>
+        <w:rPr>
+          <w:rFonts w:ascii="David" w:hAnsi="David" w:cs="David"/>
+          <w:b w:val="0"/>
+          <w:i w:val="0"/>
+          <w:sz w:val="24"/>
+          <w:szCs w:val="24"/>
+          <w:rtl w:val="1"/>
+        </w:rPr>
+        <w:t>על בסיס זה בניתי את עקרונות התגובה של מרחב, מהירות, שקיפות, אמפתיה ובהירות. התגובה תהיה מנוסחת בשפה אנושית ולא בהתגוננות משפטית קרה. הדובר יאמר את מה שידוע, יכיר ברגש, ויתחייב לבדוק, במקום לחכות שהתמונה תתבהר בזמן שהרשתות כבר רותחות. כשהזירה משותפת, השתיקה של הארגון פשוט מפנה את הבמה לאחרים.</w:t>
       </w:r>
     </w:p>
     <w:p>
@@ -1034,6 +1088,201 @@
             <w:rtl w:val="1"/>
           </w:rPr>
           <w:t xml:space="preserve">https://doi.org/10.1057/s41599-023-02069-z</w:t>
+        </w:r>
+      </w:hyperlink>
+    </w:p>
+    <w:p>
+      <w:pPr>
+        <w:bidi w:val="1"/>
+        <w:spacing w:line="360" w:lineRule="auto" w:after="200"/>
+        <w:ind w:left="720" w:hanging="720"/>
+        <w:jc w:val="both"/>
+      </w:pPr>
+      <w:r>
+        <w:rPr>
+          <w:rFonts w:ascii="David" w:hAnsi="David" w:cs="David"/>
+          <w:b w:val="0"/>
+          <w:i w:val="0"/>
+          <w:sz w:val="24"/>
+          <w:szCs w:val="24"/>
+          <w:rtl w:val="1"/>
+        </w:rPr>
+        <w:t xml:space="preserve">Oliński, M., &amp; Szamrowski, P. (2021). Facebook as an engagement tool: How are public benefit organizations building relationships with their public? </w:t>
+      </w:r>
+      <w:r>
+        <w:rPr>
+          <w:rFonts w:ascii="David" w:hAnsi="David" w:cs="David"/>
+          <w:b w:val="0"/>
+          <w:i/>
+          <w:sz w:val="24"/>
+          <w:szCs w:val="24"/>
+          <w:rtl w:val="1"/>
+        </w:rPr>
+        <w:t>PLOS ONE, 16</w:t>
+      </w:r>
+      <w:r>
+        <w:rPr>
+          <w:rFonts w:ascii="David" w:hAnsi="David" w:cs="David"/>
+          <w:b w:val="0"/>
+          <w:i w:val="0"/>
+          <w:sz w:val="24"/>
+          <w:szCs w:val="24"/>
+          <w:rtl w:val="1"/>
+        </w:rPr>
+        <w:t>(9), e0256880.</w:t>
+      </w:r>
+      <w:r>
+        <w:rPr>
+          <w:rFonts w:ascii="David" w:hAnsi="David" w:cs="David"/>
+          <w:b w:val="0"/>
+          <w:i w:val="0"/>
+          <w:sz w:val="24"/>
+          <w:szCs w:val="24"/>
+          <w:rtl w:val="1"/>
+        </w:rPr>
+        <w:t xml:space="preserve"> </w:t>
+      </w:r>
+      <w:hyperlink r:id="rId12">
+        <w:r>
+          <w:rPr>
+            <w:rFonts w:ascii="David" w:hAnsi="David" w:cs="David"/>
+            <w:sz w:val="24"/>
+            <w:szCs w:val="24"/>
+            <w:color w:val="0563C1"/>
+            <w:u w:val="single"/>
+            <w:rtl w:val="1"/>
+          </w:rPr>
+          <w:t xml:space="preserve">https://doi.org/10.1371/journal.pone.0256880</w:t>
+        </w:r>
+      </w:hyperlink>
+    </w:p>
+    <w:p>
+      <w:pPr>
+        <w:bidi w:val="1"/>
+        <w:spacing w:line="360" w:lineRule="auto" w:after="200"/>
+        <w:ind w:left="720" w:hanging="720"/>
+        <w:jc w:val="both"/>
+      </w:pPr>
+      <w:r>
+        <w:rPr>
+          <w:rFonts w:ascii="David" w:hAnsi="David" w:cs="David"/>
+          <w:b w:val="0"/>
+          <w:i w:val="0"/>
+          <w:sz w:val="24"/>
+          <w:szCs w:val="24"/>
+          <w:rtl w:val="1"/>
+        </w:rPr>
+        <w:t xml:space="preserve">MacKay, M., Colangeli, T., Gillis, D., McWhirter, J., &amp; Papadopoulos, A. (2021). Examining social media crisis communication during early COVID-19 from public health and news media for quality, content, and corresponding public sentiment. </w:t>
+      </w:r>
+      <w:r>
+        <w:rPr>
+          <w:rFonts w:ascii="David" w:hAnsi="David" w:cs="David"/>
+          <w:b w:val="0"/>
+          <w:i/>
+          <w:sz w:val="24"/>
+          <w:szCs w:val="24"/>
+          <w:rtl w:val="1"/>
+        </w:rPr>
+        <w:t>International Journal of Environmental Research and Public Health, 18</w:t>
+      </w:r>
+      <w:r>
+        <w:rPr>
+          <w:rFonts w:ascii="David" w:hAnsi="David" w:cs="David"/>
+          <w:b w:val="0"/>
+          <w:i w:val="0"/>
+          <w:sz w:val="24"/>
+          <w:szCs w:val="24"/>
+          <w:rtl w:val="1"/>
+        </w:rPr>
+        <w:t>(15), 7986.</w:t>
+      </w:r>
+      <w:r>
+        <w:rPr>
+          <w:rFonts w:ascii="David" w:hAnsi="David" w:cs="David"/>
+          <w:b w:val="0"/>
+          <w:i w:val="0"/>
+          <w:sz w:val="24"/>
+          <w:szCs w:val="24"/>
+          <w:rtl w:val="1"/>
+        </w:rPr>
+        <w:t xml:space="preserve"> </w:t>
+      </w:r>
+      <w:hyperlink r:id="rId13">
+        <w:r>
+          <w:rPr>
+            <w:rFonts w:ascii="David" w:hAnsi="David" w:cs="David"/>
+            <w:sz w:val="24"/>
+            <w:szCs w:val="24"/>
+            <w:color w:val="0563C1"/>
+            <w:u w:val="single"/>
+            <w:rtl w:val="1"/>
+          </w:rPr>
+          <w:t xml:space="preserve">https://doi.org/10.3390/ijerph18157986</w:t>
+        </w:r>
+      </w:hyperlink>
+    </w:p>
+    <w:p>
+      <w:pPr>
+        <w:bidi w:val="1"/>
+        <w:spacing w:line="360" w:lineRule="auto" w:after="200"/>
+        <w:ind w:left="720" w:hanging="720"/>
+        <w:jc w:val="both"/>
+      </w:pPr>
+      <w:r>
+        <w:rPr>
+          <w:rFonts w:ascii="David" w:hAnsi="David" w:cs="David"/>
+          <w:b w:val="0"/>
+          <w:i w:val="0"/>
+          <w:sz w:val="24"/>
+          <w:szCs w:val="24"/>
+          <w:rtl w:val="1"/>
+        </w:rPr>
+        <w:t xml:space="preserve">DeMasters, C., Morgan, K., Schwoerer, K., Richardson, M., &amp; Wiley, K. (2024). Forging connections: Nonprofits, TikTok, and authentic engagement, a mixed-methods study. </w:t>
+      </w:r>
+      <w:r>
+        <w:rPr>
+          <w:rFonts w:ascii="David" w:hAnsi="David" w:cs="David"/>
+          <w:b w:val="0"/>
+          <w:i/>
+          <w:sz w:val="24"/>
+          <w:szCs w:val="24"/>
+          <w:rtl w:val="1"/>
+        </w:rPr>
+        <w:t>Journal of Public and Nonprofit Affairs, 10</w:t>
+      </w:r>
+      <w:r>
+        <w:rPr>
+          <w:rFonts w:ascii="David" w:hAnsi="David" w:cs="David"/>
+          <w:b w:val="0"/>
+          <w:i w:val="0"/>
+          <w:sz w:val="24"/>
+          <w:szCs w:val="24"/>
+          <w:rtl w:val="1"/>
+        </w:rPr>
+        <w:t>(1).</w:t>
+      </w:r>
+      <w:r>
+        <w:rPr>
+          <w:rFonts w:ascii="David" w:hAnsi="David" w:cs="David"/>
+          <w:b w:val="0"/>
+          <w:i w:val="0"/>
+          <w:sz w:val="24"/>
+          <w:szCs w:val="24"/>
+          <w:rtl w:val="1"/>
+        </w:rPr>
+        <w:t xml:space="preserve"> </w:t>
+      </w:r>
+      <w:hyperlink r:id="rId14">
+        <w:r>
+          <w:rPr>
+            <w:rFonts w:ascii="David" w:hAnsi="David" w:cs="David"/>
+            <w:sz w:val="24"/>
+            <w:szCs w:val="24"/>
+            <w:color w:val="0563C1"/>
+            <w:u w:val="single"/>
+            <w:rtl w:val="1"/>
+          </w:rPr>
+          <w:t xml:space="preserve">https://jpna.org/index.php/jpna/article/view/814</w:t>
         </w:r>
       </w:hyperlink>
     </w:p>

</xml_diff>

<commit_message>
Fix DeMasters citation vs source: remove wrong author (Richardson), add pages 27-51 and DOI
Co-Authored-By: Claude <noreply@anthropic.com>
</commit_message>
<xml_diff>
--- a/תוכנית דוברות והסברה.docx
+++ b/תוכנית דוברות והסברה.docx
@@ -1237,7 +1237,7 @@
           <w:szCs w:val="24"/>
           <w:rtl w:val="1"/>
         </w:rPr>
-        <w:t xml:space="preserve">DeMasters, C., Morgan, K., Schwoerer, K., Richardson, M., &amp; Wiley, K. (2024). Forging connections: Nonprofits, TikTok, and authentic engagement, a mixed-methods study. </w:t>
+        <w:t xml:space="preserve">DeMasters, C., Morgan, K., Schwoerer, K., &amp; Wiley, K. (2024). Forging connections: Nonprofits, TikTok, and authentic engagement, a mixed-methods study. </w:t>
       </w:r>
       <w:r>
         <w:rPr>
@@ -1259,7 +1259,7 @@
           <w:szCs w:val="24"/>
           <w:rtl w:val="1"/>
         </w:rPr>
-        <w:t>(1).</w:t>
+        <w:t>(1), 27-51.</w:t>
       </w:r>
       <w:r>
         <w:rPr>
@@ -1282,7 +1282,7 @@
             <w:u w:val="single"/>
             <w:rtl w:val="1"/>
           </w:rPr>
-          <w:t xml:space="preserve">https://jpna.org/index.php/jpna/article/view/814</w:t>
+          <w:t xml:space="preserve">https://doi.org/10.20899/jpna.dky82f18</w:t>
         </w:r>
       </w:hyperlink>
     </w:p>

</xml_diff>

<commit_message>
Expand Hasbara plan per guidelines: SWOT table, audience segmentation, timeline+KPIs, crisis team roles and scenario table
Co-Authored-By: Claude <noreply@anthropic.com>
</commit_message>
<xml_diff>
--- a/תוכנית דוברות והסברה.docx
+++ b/תוכנית דוברות והסברה.docx
@@ -326,6 +326,283 @@
           <w:szCs w:val="26"/>
           <w:rtl w:val="1"/>
         </w:rPr>
+        <w:t>ניתוח SWOT</w:t>
+      </w:r>
+    </w:p>
+    <w:tbl>
+      <w:tblPr>
+        <w:tblStyle w:val="TableGrid"/>
+        <w:tblW w:type="auto" w:w="0"/>
+        <w:jc w:val="right"/>
+        <w:tblLook w:firstColumn="1" w:firstRow="1" w:lastColumn="0" w:lastRow="0" w:noHBand="0" w:noVBand="1" w:val="04A0"/>
+      </w:tblPr>
+      <w:tblGrid>
+        <w:gridCol w:w="4680"/>
+        <w:gridCol w:w="4680"/>
+      </w:tblGrid>
+      <w:tr>
+        <w:tc>
+          <w:tcPr>
+            <w:tcW w:type="dxa" w:w="1872"/>
+          </w:tcPr>
+          <w:p>
+            <w:pPr>
+              <w:bidi w:val="1"/>
+              <w:jc w:val="right"/>
+            </w:pPr>
+            <w:r/>
+            <w:r>
+              <w:rPr>
+                <w:rFonts w:ascii="David" w:hAnsi="David" w:cs="David"/>
+                <w:b/>
+                <w:i w:val="0"/>
+                <w:sz w:val="22"/>
+                <w:szCs w:val="22"/>
+                <w:rtl w:val="1"/>
+              </w:rPr>
+              <w:t>רכיב</w:t>
+            </w:r>
+          </w:p>
+        </w:tc>
+        <w:tc>
+          <w:tcPr>
+            <w:tcW w:type="dxa" w:w="6768"/>
+          </w:tcPr>
+          <w:p>
+            <w:pPr>
+              <w:bidi w:val="1"/>
+              <w:jc w:val="right"/>
+            </w:pPr>
+            <w:r/>
+            <w:r>
+              <w:rPr>
+                <w:rFonts w:ascii="David" w:hAnsi="David" w:cs="David"/>
+                <w:b/>
+                <w:i w:val="0"/>
+                <w:sz w:val="22"/>
+                <w:szCs w:val="22"/>
+                <w:rtl w:val="1"/>
+              </w:rPr>
+              <w:t>תוכן</w:t>
+            </w:r>
+          </w:p>
+        </w:tc>
+      </w:tr>
+      <w:tr>
+        <w:tc>
+          <w:tcPr>
+            <w:tcW w:type="dxa" w:w="1872"/>
+          </w:tcPr>
+          <w:p>
+            <w:pPr>
+              <w:bidi w:val="1"/>
+              <w:jc w:val="right"/>
+            </w:pPr>
+            <w:r/>
+            <w:r>
+              <w:rPr>
+                <w:rFonts w:ascii="David" w:hAnsi="David" w:cs="David"/>
+                <w:b w:val="0"/>
+                <w:i w:val="0"/>
+                <w:sz w:val="22"/>
+                <w:szCs w:val="22"/>
+                <w:rtl w:val="1"/>
+              </w:rPr>
+              <w:t>חוזקות</w:t>
+            </w:r>
+          </w:p>
+        </w:tc>
+        <w:tc>
+          <w:tcPr>
+            <w:tcW w:type="dxa" w:w="6768"/>
+          </w:tcPr>
+          <w:p>
+            <w:pPr>
+              <w:bidi w:val="1"/>
+              <w:jc w:val="right"/>
+            </w:pPr>
+            <w:r/>
+            <w:r>
+              <w:rPr>
+                <w:rFonts w:ascii="David" w:hAnsi="David" w:cs="David"/>
+                <w:b w:val="0"/>
+                <w:i w:val="0"/>
+                <w:sz w:val="22"/>
+                <w:szCs w:val="22"/>
+                <w:rtl w:val="1"/>
+              </w:rPr>
+              <w:t>עשור של ניסיון, צוות מקצועי, תוצאות מוכחות בשטח, וסיפורי בוגרים אותנטיים ומרגשים.</w:t>
+            </w:r>
+          </w:p>
+        </w:tc>
+      </w:tr>
+      <w:tr>
+        <w:tc>
+          <w:tcPr>
+            <w:tcW w:type="dxa" w:w="1872"/>
+          </w:tcPr>
+          <w:p>
+            <w:pPr>
+              <w:bidi w:val="1"/>
+              <w:jc w:val="right"/>
+            </w:pPr>
+            <w:r/>
+            <w:r>
+              <w:rPr>
+                <w:rFonts w:ascii="David" w:hAnsi="David" w:cs="David"/>
+                <w:b w:val="0"/>
+                <w:i w:val="0"/>
+                <w:sz w:val="22"/>
+                <w:szCs w:val="22"/>
+                <w:rtl w:val="1"/>
+              </w:rPr>
+              <w:t>חולשות</w:t>
+            </w:r>
+          </w:p>
+        </w:tc>
+        <w:tc>
+          <w:tcPr>
+            <w:tcW w:type="dxa" w:w="6768"/>
+          </w:tcPr>
+          <w:p>
+            <w:pPr>
+              <w:bidi w:val="1"/>
+              <w:jc w:val="right"/>
+            </w:pPr>
+            <w:r/>
+            <w:r>
+              <w:rPr>
+                <w:rFonts w:ascii="David" w:hAnsi="David" w:cs="David"/>
+                <w:b w:val="0"/>
+                <w:i w:val="0"/>
+                <w:sz w:val="22"/>
+                <w:szCs w:val="22"/>
+                <w:rtl w:val="1"/>
+              </w:rPr>
+              <w:t>מודעות ציבורית נמוכה, נוכחות דיגיטלית דלה, ותלות בתקציב לא יציב שמגיע ממעט תורמים.</w:t>
+            </w:r>
+          </w:p>
+        </w:tc>
+      </w:tr>
+      <w:tr>
+        <w:tc>
+          <w:tcPr>
+            <w:tcW w:type="dxa" w:w="1872"/>
+          </w:tcPr>
+          <w:p>
+            <w:pPr>
+              <w:bidi w:val="1"/>
+              <w:jc w:val="right"/>
+            </w:pPr>
+            <w:r/>
+            <w:r>
+              <w:rPr>
+                <w:rFonts w:ascii="David" w:hAnsi="David" w:cs="David"/>
+                <w:b w:val="0"/>
+                <w:i w:val="0"/>
+                <w:sz w:val="22"/>
+                <w:szCs w:val="22"/>
+                <w:rtl w:val="1"/>
+              </w:rPr>
+              <w:t>הזדמנויות</w:t>
+            </w:r>
+          </w:p>
+        </w:tc>
+        <w:tc>
+          <w:tcPr>
+            <w:tcW w:type="dxa" w:w="6768"/>
+          </w:tcPr>
+          <w:p>
+            <w:pPr>
+              <w:bidi w:val="1"/>
+              <w:jc w:val="right"/>
+            </w:pPr>
+            <w:r/>
+            <w:r>
+              <w:rPr>
+                <w:rFonts w:ascii="David" w:hAnsi="David" w:cs="David"/>
+                <w:b w:val="0"/>
+                <w:i w:val="0"/>
+                <w:sz w:val="22"/>
+                <w:szCs w:val="22"/>
+                <w:rtl w:val="1"/>
+              </w:rPr>
+              <w:t>עניין תקשורתי בנוער בפתיחת השנה, מגמת אחריות תאגידית, ופוטנציאל לא ממומש ברשתות ובשותפויות.</w:t>
+            </w:r>
+          </w:p>
+        </w:tc>
+      </w:tr>
+      <w:tr>
+        <w:tc>
+          <w:tcPr>
+            <w:tcW w:type="dxa" w:w="1872"/>
+          </w:tcPr>
+          <w:p>
+            <w:pPr>
+              <w:bidi w:val="1"/>
+              <w:jc w:val="right"/>
+            </w:pPr>
+            <w:r/>
+            <w:r>
+              <w:rPr>
+                <w:rFonts w:ascii="David" w:hAnsi="David" w:cs="David"/>
+                <w:b w:val="0"/>
+                <w:i w:val="0"/>
+                <w:sz w:val="22"/>
+                <w:szCs w:val="22"/>
+                <w:rtl w:val="1"/>
+              </w:rPr>
+              <w:t>איומים</w:t>
+            </w:r>
+          </w:p>
+        </w:tc>
+        <w:tc>
+          <w:tcPr>
+            <w:tcW w:type="dxa" w:w="6768"/>
+          </w:tcPr>
+          <w:p>
+            <w:pPr>
+              <w:bidi w:val="1"/>
+              <w:jc w:val="right"/>
+            </w:pPr>
+            <w:r/>
+            <w:r>
+              <w:rPr>
+                <w:rFonts w:ascii="David" w:hAnsi="David" w:cs="David"/>
+                <w:b w:val="0"/>
+                <w:i w:val="0"/>
+                <w:sz w:val="22"/>
+                <w:szCs w:val="22"/>
+                <w:rtl w:val="1"/>
+              </w:rPr>
+              <w:t>סטיגמה כלפי נוער בסיכון, ביקורת ציבורית על התנהלות עמותות, ותחרות על תשומת לב ועל תרומות.</w:t>
+            </w:r>
+          </w:p>
+        </w:tc>
+      </w:tr>
+    </w:tbl>
+    <w:p>
+      <w:pPr>
+        <w:bidi w:val="1"/>
+        <w:spacing w:line="360" w:lineRule="auto" w:after="80"/>
+        <w:jc w:val="both"/>
+      </w:pPr>
+    </w:p>
+    <w:p>
+      <w:pPr>
+        <w:bidi w:val="1"/>
+        <w:spacing w:line="360" w:lineRule="auto" w:after="120"/>
+        <w:jc w:val="right"/>
+      </w:pPr>
+      <w:r>
+        <w:rPr>
+          <w:rFonts w:ascii="David" w:hAnsi="David" w:cs="David"/>
+          <w:b/>
+          <w:i w:val="0"/>
+          <w:sz w:val="26"/>
+          <w:szCs w:val="26"/>
+          <w:rtl w:val="1"/>
+        </w:rPr>
         <w:t>המטרה התקשורתית</w:t>
       </w:r>
     </w:p>
@@ -381,6 +658,24 @@
           <w:rtl w:val="1"/>
         </w:rPr>
         <w:t>קהל היעד המרכזי הוא תורמים פוטנציאליים, פרטיים ועסקיים במסגרת אחריות תאגידית, יחד עם הציבור הרחב שמעצב את האקלים הציבורי. סביבם יש קהלים משניים חשובים לא פחות, מקבלי החלטות ברשויות המקומיות ובמשרד הרווחה, הורים בקהילה, ובני הנוער עצמם. כלי התקשורת הם קהל מתווך, לא מטרה בפני עצמה, אלא הדרך להגיע לכל השאר.</w:t>
+      </w:r>
+    </w:p>
+    <w:p>
+      <w:pPr>
+        <w:bidi w:val="1"/>
+        <w:spacing w:line="360" w:lineRule="auto" w:after="160"/>
+        <w:jc w:val="both"/>
+      </w:pPr>
+      <w:r>
+        <w:rPr>
+          <w:rFonts w:ascii="David" w:hAnsi="David" w:cs="David"/>
+          <w:b w:val="0"/>
+          <w:i w:val="0"/>
+          <w:sz w:val="24"/>
+          <w:szCs w:val="24"/>
+          <w:rtl w:val="1"/>
+        </w:rPr>
+        <w:t>כדי לדבר עם כל קהל בשפה שלו, פילחתי אותם לפי מה שמניע כל אחד. התורם הפרטי מגיב לסיפור האישי ולתחושה שהתרומה שלו משנה חיים ממש. התורם העסקי מחפש שותפות שמייצרת גם ערך מיתוגי ואחריות תאגידית. מקבל ההחלטות ברשות רוצה לראות נתונים ושיתוף פעולה מוסדי. וההורים והנוער עצמם צריכים קודם כול לחוש שהעמותה רואה אותם בכבוד, ולא כבעיה שצריך לפתור. לכל קהל מותאם דגש אחר מתוך אותם מסרי עוגן.</w:t>
       </w:r>
     </w:p>
     <w:p>
@@ -749,6 +1044,42 @@
       </w:r>
     </w:p>
     <w:p>
+      <w:pPr>
+        <w:bidi w:val="1"/>
+        <w:spacing w:line="360" w:lineRule="auto" w:after="120"/>
+        <w:jc w:val="right"/>
+      </w:pPr>
+      <w:r>
+        <w:rPr>
+          <w:rFonts w:ascii="David" w:hAnsi="David" w:cs="David"/>
+          <w:b/>
+          <w:i w:val="0"/>
+          <w:sz w:val="26"/>
+          <w:szCs w:val="26"/>
+          <w:rtl w:val="1"/>
+        </w:rPr>
+        <w:t>לוח זמנים ומדדי הצלחה</w:t>
+      </w:r>
+    </w:p>
+    <w:p>
+      <w:pPr>
+        <w:bidi w:val="1"/>
+        <w:spacing w:line="360" w:lineRule="auto" w:after="160"/>
+        <w:jc w:val="both"/>
+      </w:pPr>
+      <w:r>
+        <w:rPr>
+          <w:rFonts w:ascii="David" w:hAnsi="David" w:cs="David"/>
+          <w:b w:val="0"/>
+          <w:i w:val="0"/>
+          <w:sz w:val="24"/>
+          <w:szCs w:val="24"/>
+          <w:rtl w:val="1"/>
+        </w:rPr>
+        <w:t>ארבע היוזמות רצות במקביל לאורך אוגוסט וספטמבר. קמפיין הסושיאל פרוס על כל התקופה, וההשקה במדיה המסורתית והאירוע ממוקדים לשבוע פתיחת השנה, נקודת השיא של התוכנית. את ההצלחה אני מודדת בכמה מדדים פשוטים, היקף ואיכות החשיפה התקשורתית, מדדי מעורבות ברשתות כמו שיתופים, תגובות וצפיות מלאות, מספר התורמים החדשים והיקף התרומות, ולאורך זמן גם שינוי בטון של השיח סביב נוער בסיכון. מדידה שוטפת לאורך הדרך מאפשרת לתקן תוך כדי תנועה, ולא רק להסתכל אחורה בסוף.</w:t>
+      </w:r>
+    </w:p>
+    <w:p>
       <w:r>
         <w:br w:type="page"/>
       </w:r>
@@ -896,6 +1227,319 @@
         </w:rPr>
         <w:t>כאן העמותה מראה מה למדה ומה שינתה, מפרסמת את המסקנות ואת הצעדים המתקנים, וחוזרת לספר את הסיפור החיובי שלה דרך אותם ערוצים דיגיטליים ומסורתיים שבניתי. משבר מנוהל היטב יכול אפילו לחזק את האמון, אם הציבור רואה ארגון שלוקח אחריות ולא מתחמק.</w:t>
       </w:r>
+    </w:p>
+    <w:p>
+      <w:pPr>
+        <w:bidi w:val="1"/>
+        <w:spacing w:line="360" w:lineRule="auto" w:after="120"/>
+        <w:jc w:val="right"/>
+      </w:pPr>
+      <w:r>
+        <w:rPr>
+          <w:rFonts w:ascii="David" w:hAnsi="David" w:cs="David"/>
+          <w:b/>
+          <w:i w:val="0"/>
+          <w:sz w:val="26"/>
+          <w:szCs w:val="26"/>
+          <w:rtl w:val="1"/>
+        </w:rPr>
+        <w:t>צוות המשבר וחלוקת התפקידים</w:t>
+      </w:r>
+    </w:p>
+    <w:p>
+      <w:pPr>
+        <w:bidi w:val="1"/>
+        <w:spacing w:line="360" w:lineRule="auto" w:after="160"/>
+        <w:jc w:val="both"/>
+      </w:pPr>
+      <w:r>
+        <w:rPr>
+          <w:rFonts w:ascii="David" w:hAnsi="David" w:cs="David"/>
+          <w:b w:val="0"/>
+          <w:i w:val="0"/>
+          <w:sz w:val="24"/>
+          <w:szCs w:val="24"/>
+          <w:rtl w:val="1"/>
+        </w:rPr>
+        <w:t>צוות המשבר קטן ומוגדר מראש. מנכ"לית העמותה מובילה ומקבלת את ההחלטות הגדולות, הדובר היחיד מדבר החוצה, איש מקצוע מהתחום הטיפולי מוודא שהתגובה לא פוגעת בחניכים או בתהליך השיקומי, ואחראי ניטור עוקב אחר הרשתות ואחר התקשורת. כל שאר אנשי העמותה יודעים דבר אחד, להפנות כל פנייה תקשורתית לדובר ולא להגיב בעצמם.</w:t>
+      </w:r>
+    </w:p>
+    <w:p>
+      <w:pPr>
+        <w:bidi w:val="1"/>
+        <w:spacing w:line="360" w:lineRule="auto" w:after="120"/>
+        <w:jc w:val="right"/>
+      </w:pPr>
+      <w:r>
+        <w:rPr>
+          <w:rFonts w:ascii="David" w:hAnsi="David" w:cs="David"/>
+          <w:b/>
+          <w:i w:val="0"/>
+          <w:sz w:val="26"/>
+          <w:szCs w:val="26"/>
+          <w:rtl w:val="1"/>
+        </w:rPr>
+        <w:t>מיפוי תרחישים ותגובה ראשונית</w:t>
+      </w:r>
+    </w:p>
+    <w:tbl>
+      <w:tblPr>
+        <w:tblStyle w:val="TableGrid"/>
+        <w:tblW w:type="auto" w:w="0"/>
+        <w:jc w:val="right"/>
+        <w:tblLook w:firstColumn="1" w:firstRow="1" w:lastColumn="0" w:lastRow="0" w:noHBand="0" w:noVBand="1" w:val="04A0"/>
+      </w:tblPr>
+      <w:tblGrid>
+        <w:gridCol w:w="4680"/>
+        <w:gridCol w:w="4680"/>
+      </w:tblGrid>
+      <w:tr>
+        <w:tc>
+          <w:tcPr>
+            <w:tcW w:type="dxa" w:w="3744"/>
+          </w:tcPr>
+          <w:p>
+            <w:pPr>
+              <w:bidi w:val="1"/>
+              <w:jc w:val="right"/>
+            </w:pPr>
+            <w:r/>
+            <w:r>
+              <w:rPr>
+                <w:rFonts w:ascii="David" w:hAnsi="David" w:cs="David"/>
+                <w:b/>
+                <w:i w:val="0"/>
+                <w:sz w:val="22"/>
+                <w:szCs w:val="22"/>
+                <w:rtl w:val="1"/>
+              </w:rPr>
+              <w:t>תרחיש אפשרי</w:t>
+            </w:r>
+          </w:p>
+        </w:tc>
+        <w:tc>
+          <w:tcPr>
+            <w:tcW w:type="dxa" w:w="4896"/>
+          </w:tcPr>
+          <w:p>
+            <w:pPr>
+              <w:bidi w:val="1"/>
+              <w:jc w:val="right"/>
+            </w:pPr>
+            <w:r/>
+            <w:r>
+              <w:rPr>
+                <w:rFonts w:ascii="David" w:hAnsi="David" w:cs="David"/>
+                <w:b/>
+                <w:i w:val="0"/>
+                <w:sz w:val="22"/>
+                <w:szCs w:val="22"/>
+                <w:rtl w:val="1"/>
+              </w:rPr>
+              <w:t>תגובה ראשונית</w:t>
+            </w:r>
+          </w:p>
+        </w:tc>
+      </w:tr>
+      <w:tr>
+        <w:tc>
+          <w:tcPr>
+            <w:tcW w:type="dxa" w:w="3744"/>
+          </w:tcPr>
+          <w:p>
+            <w:pPr>
+              <w:bidi w:val="1"/>
+              <w:jc w:val="right"/>
+            </w:pPr>
+            <w:r/>
+            <w:r>
+              <w:rPr>
+                <w:rFonts w:ascii="David" w:hAnsi="David" w:cs="David"/>
+                <w:b w:val="0"/>
+                <w:i w:val="0"/>
+                <w:sz w:val="22"/>
+                <w:szCs w:val="22"/>
+                <w:rtl w:val="1"/>
+              </w:rPr>
+              <w:t>חשד לפגיעה או הזנחה של חניך במסגרת</w:t>
+            </w:r>
+          </w:p>
+        </w:tc>
+        <w:tc>
+          <w:tcPr>
+            <w:tcW w:type="dxa" w:w="4896"/>
+          </w:tcPr>
+          <w:p>
+            <w:pPr>
+              <w:bidi w:val="1"/>
+              <w:jc w:val="right"/>
+            </w:pPr>
+            <w:r/>
+            <w:r>
+              <w:rPr>
+                <w:rFonts w:ascii="David" w:hAnsi="David" w:cs="David"/>
+                <w:b w:val="0"/>
+                <w:i w:val="0"/>
+                <w:sz w:val="22"/>
+                <w:szCs w:val="22"/>
+                <w:rtl w:val="1"/>
+              </w:rPr>
+              <w:t>הצהרת החזקה תוך שעה, נטילת אחריות ואמפתיה, פתיחת בדיקה ושיתוף פעולה עם הרשויות.</w:t>
+            </w:r>
+          </w:p>
+        </w:tc>
+      </w:tr>
+      <w:tr>
+        <w:tc>
+          <w:tcPr>
+            <w:tcW w:type="dxa" w:w="3744"/>
+          </w:tcPr>
+          <w:p>
+            <w:pPr>
+              <w:bidi w:val="1"/>
+              <w:jc w:val="right"/>
+            </w:pPr>
+            <w:r/>
+            <w:r>
+              <w:rPr>
+                <w:rFonts w:ascii="David" w:hAnsi="David" w:cs="David"/>
+                <w:b w:val="0"/>
+                <w:i w:val="0"/>
+                <w:sz w:val="22"/>
+                <w:szCs w:val="22"/>
+                <w:rtl w:val="1"/>
+              </w:rPr>
+              <w:t>האשמה בניהול כספי לא תקין</w:t>
+            </w:r>
+          </w:p>
+        </w:tc>
+        <w:tc>
+          <w:tcPr>
+            <w:tcW w:type="dxa" w:w="4896"/>
+          </w:tcPr>
+          <w:p>
+            <w:pPr>
+              <w:bidi w:val="1"/>
+              <w:jc w:val="right"/>
+            </w:pPr>
+            <w:r/>
+            <w:r>
+              <w:rPr>
+                <w:rFonts w:ascii="David" w:hAnsi="David" w:cs="David"/>
+                <w:b w:val="0"/>
+                <w:i w:val="0"/>
+                <w:sz w:val="22"/>
+                <w:szCs w:val="22"/>
+                <w:rtl w:val="1"/>
+              </w:rPr>
+              <w:t>שקיפות מלאה, פרסום נתונים ודוח כספי, והזמנה לבדיקה חיצונית בלתי תלויה.</w:t>
+            </w:r>
+          </w:p>
+        </w:tc>
+      </w:tr>
+      <w:tr>
+        <w:tc>
+          <w:tcPr>
+            <w:tcW w:type="dxa" w:w="3744"/>
+          </w:tcPr>
+          <w:p>
+            <w:pPr>
+              <w:bidi w:val="1"/>
+              <w:jc w:val="right"/>
+            </w:pPr>
+            <w:r/>
+            <w:r>
+              <w:rPr>
+                <w:rFonts w:ascii="David" w:hAnsi="David" w:cs="David"/>
+                <w:b w:val="0"/>
+                <w:i w:val="0"/>
+                <w:sz w:val="22"/>
+                <w:szCs w:val="22"/>
+                <w:rtl w:val="1"/>
+              </w:rPr>
+              <w:t>פרסום שלילי או מידע כוזב ברשתות</w:t>
+            </w:r>
+          </w:p>
+        </w:tc>
+        <w:tc>
+          <w:tcPr>
+            <w:tcW w:type="dxa" w:w="4896"/>
+          </w:tcPr>
+          <w:p>
+            <w:pPr>
+              <w:bidi w:val="1"/>
+              <w:jc w:val="right"/>
+            </w:pPr>
+            <w:r/>
+            <w:r>
+              <w:rPr>
+                <w:rFonts w:ascii="David" w:hAnsi="David" w:cs="David"/>
+                <w:b w:val="0"/>
+                <w:i w:val="0"/>
+                <w:sz w:val="22"/>
+                <w:szCs w:val="22"/>
+                <w:rtl w:val="1"/>
+              </w:rPr>
+              <w:t>תיקון עובדתי מהיר ומנומס, פנייה ישירה למפרסם, וגיוס בוגרים ושותפים כשגרירים אמינים.</w:t>
+            </w:r>
+          </w:p>
+        </w:tc>
+      </w:tr>
+      <w:tr>
+        <w:tc>
+          <w:tcPr>
+            <w:tcW w:type="dxa" w:w="3744"/>
+          </w:tcPr>
+          <w:p>
+            <w:pPr>
+              <w:bidi w:val="1"/>
+              <w:jc w:val="right"/>
+            </w:pPr>
+            <w:r/>
+            <w:r>
+              <w:rPr>
+                <w:rFonts w:ascii="David" w:hAnsi="David" w:cs="David"/>
+                <w:b w:val="0"/>
+                <w:i w:val="0"/>
+                <w:sz w:val="22"/>
+                <w:szCs w:val="22"/>
+                <w:rtl w:val="1"/>
+              </w:rPr>
+              <w:t>דליפת מידע אישי על חניך</w:t>
+            </w:r>
+          </w:p>
+        </w:tc>
+        <w:tc>
+          <w:tcPr>
+            <w:tcW w:type="dxa" w:w="4896"/>
+          </w:tcPr>
+          <w:p>
+            <w:pPr>
+              <w:bidi w:val="1"/>
+              <w:jc w:val="right"/>
+            </w:pPr>
+            <w:r/>
+            <w:r>
+              <w:rPr>
+                <w:rFonts w:ascii="David" w:hAnsi="David" w:cs="David"/>
+                <w:b w:val="0"/>
+                <w:i w:val="0"/>
+                <w:sz w:val="22"/>
+                <w:szCs w:val="22"/>
+                <w:rtl w:val="1"/>
+              </w:rPr>
+              <w:t>עצירה מיידית של הדליפה, יידוע הנפגעים, טיפול טכני ומשפטי, והכרה כנה באחריות.</w:t>
+            </w:r>
+          </w:p>
+        </w:tc>
+      </w:tr>
+    </w:tbl>
+    <w:p>
+      <w:pPr>
+        <w:bidi w:val="1"/>
+        <w:spacing w:line="360" w:lineRule="auto" w:after="80"/>
+        <w:jc w:val="both"/>
+      </w:pPr>
     </w:p>
     <w:p>
       <w:r>

</xml_diff>

<commit_message>
Tie Hasbara plan explicitly to course topics (new-world principles, PR-press relations, crisis management)
Co-Authored-By: Claude <noreply@anthropic.com>
</commit_message>
<xml_diff>
--- a/תוכנית דוברות והסברה.docx
+++ b/תוכנית דוברות והסברה.docx
@@ -273,6 +273,24 @@
           <w:rtl w:val="1"/>
         </w:rPr>
         <w:t>רובד א: המרכיב האסטרטגי</w:t>
+      </w:r>
+    </w:p>
+    <w:p>
+      <w:pPr>
+        <w:bidi w:val="1"/>
+        <w:spacing w:line="360" w:lineRule="auto" w:after="160"/>
+        <w:jc w:val="both"/>
+      </w:pPr>
+      <w:r>
+        <w:rPr>
+          <w:rFonts w:ascii="David" w:hAnsi="David" w:cs="David"/>
+          <w:b w:val="0"/>
+          <w:i w:val="0"/>
+          <w:sz w:val="24"/>
+          <w:szCs w:val="24"/>
+          <w:rtl w:val="1"/>
+        </w:rPr>
+        <w:t>הרובד הזה נבנה על פי עקרונות העולם החדש של הדוברות שנלמדו בקורס, שלפיהם כל מהלך תקשורתי מתחיל בהגדרה מדויקת של נקודת המוצא, המטרה, הקהל, העיתוי, השחקנים והמסרים, עוד לפני שנוגעים ביוזמות עצמן.</w:t>
       </w:r>
     </w:p>
     <w:p>
@@ -860,7 +878,7 @@
           <w:szCs w:val="24"/>
           <w:rtl w:val="1"/>
         </w:rPr>
-        <w:t>את האסטרטגיה תרגמתי לארבע יוזמות יחסי ציבור, שתיים במדיה הדיגיטלית ושתיים במדיה המסורתית. כל אחת מתוארת כאן בהרחבה, עם המטרה, הקהל, והדרך שבה היא מגישה את מסרי העוגן.</w:t>
+        <w:t>את האסטרטגיה תרגמתי לארבע יוזמות יחסי ציבור, שתיים במדיה הדיגיטלית ושתיים במדיה המסורתית. כל אחת מתוארת כאן בהרחבה, עם המטרה, הקהל, והדרך שבה היא מגישה את מסרי העוגן. החלוקה הזאת נשענת על מה שנלמד בקורס, גם על המעבר מתקשורת מסורתית לרשתות החברתיות והשפעתן על הדוברות, וגם על פרק יחסי הדוברות מול התקשורת, שעסק בעבודה עם עיתונאים, בכתיבת הודעות לעיתונות ובארגון מסיבות עיתונאים.</w:t>
       </w:r>
     </w:p>
     <w:p>
@@ -1100,6 +1118,24 @@
           <w:rtl w:val="1"/>
         </w:rPr>
         <w:t>רובד ג: ניהול משבר קטגורי</w:t>
+      </w:r>
+    </w:p>
+    <w:p>
+      <w:pPr>
+        <w:bidi w:val="1"/>
+        <w:spacing w:line="360" w:lineRule="auto" w:after="160"/>
+        <w:jc w:val="both"/>
+      </w:pPr>
+      <w:r>
+        <w:rPr>
+          <w:rFonts w:ascii="David" w:hAnsi="David" w:cs="David"/>
+          <w:b w:val="0"/>
+          <w:i w:val="0"/>
+          <w:sz w:val="24"/>
+          <w:szCs w:val="24"/>
+          <w:rtl w:val="1"/>
+        </w:rPr>
+        <w:t>ניהול משברים תקשורתיים היה אחד הנושאים המרכזיים בקורס, בפרק האסטרטגיות התקשורתיות בעידן הדיגיטלי, וכאן אני מיישמת אותו על מקרה קונקרטי של עמותת מרחב.</w:t>
       </w:r>
     </w:p>
     <w:p>

</xml_diff>

<commit_message>
Fix RTL tables: place bidiVisual right after tblStyle (schema-correct) in both Hasbara and Gan portfolio
Co-Authored-By: Claude <noreply@anthropic.com>
</commit_message>
<xml_diff>
--- a/תוכנית דוברות והסברה.docx
+++ b/תוכנית דוברות והסברה.docx
@@ -350,10 +350,10 @@
     <w:tbl>
       <w:tblPr>
         <w:tblStyle w:val="TableGrid"/>
+        <w:bidiVisual/>
         <w:tblW w:type="auto" w:w="0"/>
         <w:jc w:val="right"/>
         <w:tblLook w:firstColumn="1" w:firstRow="1" w:lastColumn="0" w:lastRow="0" w:noHBand="0" w:noVBand="1" w:val="04A0"/>
-        <w:bidiVisual/>
       </w:tblPr>
       <w:tblGrid>
         <w:gridCol w:w="4680"/>
@@ -1322,10 +1322,10 @@
     <w:tbl>
       <w:tblPr>
         <w:tblStyle w:val="TableGrid"/>
+        <w:bidiVisual/>
         <w:tblW w:type="auto" w:w="0"/>
         <w:jc w:val="right"/>
         <w:tblLook w:firstColumn="1" w:firstRow="1" w:lastColumn="0" w:lastRow="0" w:noHBand="0" w:noVBand="1" w:val="04A0"/>
-        <w:bidiVisual/>
       </w:tblPr>
       <w:tblGrid>
         <w:gridCol w:w="4680"/>

</xml_diff>

<commit_message>
Fill submitter (Mohamed Abu Swed, ID 201257680) and convert Hasbara to masculine voice
Co-Authored-By: Claude <noreply@anthropic.com>
</commit_message>
<xml_diff>
--- a/תוכנית דוברות והסברה.docx
+++ b/תוכנית דוברות והסברה.docx
@@ -172,7 +172,7 @@
           <w:szCs w:val="26"/>
           <w:rtl w:val="1"/>
         </w:rPr>
-        <w:t>מגישה: ___________________</w:t>
+        <w:t>מגיש: מוחמד אבו סויד (Mohamed Abu Swed)</w:t>
       </w:r>
     </w:p>
     <w:p>
@@ -190,7 +190,7 @@
           <w:szCs w:val="26"/>
           <w:rtl w:val="1"/>
         </w:rPr>
-        <w:t>ת.ז: ___________________</w:t>
+        <w:t>ת.ז: 201257680</w:t>
       </w:r>
     </w:p>
     <w:p>
@@ -326,7 +326,7 @@
           <w:szCs w:val="24"/>
           <w:rtl w:val="1"/>
         </w:rPr>
-        <w:t>העובדות ראשית. לעמותת מרחב יש עשור של עבודה, צוות מקצועי, ותוצאות מוכחות בשטח, ירידה בנשירה ובמעורבות בעבריינות בקרב מי שהשתתפו בתוכניות. לצד זה, המודעות הציבורית אליה נמוכה, הנוכחות הדיגיטלית שלה דלה, ומרבית התקציב מגיע ממספר קטן של תורמים, מה שהופך אותה לפגיעה. העמדות בשטח מפוצלות. יש אהדה לילדים, אבל יש גם חשד וסטיגמה כלפי "נוער בסיכון", שנתפס לא פעם כאיום ולא כמי שזקוק להזדמנות. זו נקודת המוצא שממנה אני יוצאת.</w:t>
+        <w:t>העובדות ראשית. לעמותת מרחב יש עשור של עבודה, צוות מקצועי, ותוצאות מוכחות בשטח, ירידה בנשירה ובמעורבות בעבריינות בקרב מי שהשתתפו בתוכניות. לצד זה, המודעות הציבורית אליה נמוכה, הנוכחות הדיגיטלית שלה דלה, ומרבית התקציב מגיע ממספר קטן של תורמים, מה שהופך אותה לפגיעה. העמדות בשטח מפוצלות. יש אהדה לילדים, אבל יש גם חשד וסטיגמה כלפי "נוער בסיכון", שנתפס לא פעם כאיום ולא כמי שזקוק להזדמנות. זו נקודת המוצא שממנה אני יוצא.</w:t>
       </w:r>
     </w:p>
     <w:p>
@@ -915,7 +915,7 @@
           <w:szCs w:val="24"/>
           <w:rtl w:val="1"/>
         </w:rPr>
-        <w:t>הלב של הזירה הדיגיטלית הוא סדרת סרטונים קצרים, דקה כל אחד, של בוגרי העמותה. כל סרטון מספר סיפור אישי אחד, מהרגע הקשה ועד להווה, ונחתם באותו משפט, מישהו האמין בי. הסרטונים מופצים באינסטגרם, בטיקטוק ובפייסבוק לאורך חודש ספטמבר, עם האשטאג אחיד וקריאה ברורה לפעולה, לשתף ולתרום. אני משלבת גם משפיענים שהנושא קרוב לליבם, כדי להרחיב את ההגעה מעבר לעוקבים של העמותה. היוזמה הזאת מגישה את המסר האמוציונלי במלואו, ופונה לציבור הרחב ולתורמים הפרטיים.</w:t>
+        <w:t>הלב של הזירה הדיגיטלית הוא סדרת סרטונים קצרים, דקה כל אחד, של בוגרי העמותה. כל סרטון מספר סיפור אישי אחד, מהרגע הקשה ועד להווה, ונחתם באותו משפט, מישהו האמין בי. הסרטונים מופצים באינסטגרם, בטיקטוק ובפייסבוק לאורך חודש ספטמבר, עם האשטאג אחיד וקריאה ברורה לפעולה, לשתף ולתרום. אני משלב גם משפיענים שהנושא קרוב לליבם, כדי להרחיב את ההגעה מעבר לעוקבים של העמותה. היוזמה הזאת מגישה את המסר האמוציונלי במלואו, ופונה לציבור הרחב ולתורמים הפרטיים.</w:t>
       </w:r>
     </w:p>
     <w:p>
@@ -1095,7 +1095,7 @@
           <w:szCs w:val="24"/>
           <w:rtl w:val="1"/>
         </w:rPr>
-        <w:t>ארבע היוזמות רצות במקביל לאורך אוגוסט וספטמבר. קמפיין הסושיאל פרוס על כל התקופה, וההשקה במדיה המסורתית והאירוע ממוקדים לשבוע פתיחת השנה, נקודת השיא של התוכנית. את ההצלחה אני מודדת בכמה מדדים פשוטים, היקף ואיכות החשיפה התקשורתית, מדדי מעורבות ברשתות כמו שיתופים, תגובות וצפיות מלאות, מספר התורמים החדשים והיקף התרומות, ולאורך זמן גם שינוי בטון של השיח סביב נוער בסיכון. מדידה שוטפת לאורך הדרך מאפשרת לתקן תוך כדי תנועה, ולא רק להסתכל אחורה בסוף.</w:t>
+        <w:t>ארבע היוזמות רצות במקביל לאורך אוגוסט וספטמבר. קמפיין הסושיאל פרוס על כל התקופה, וההשקה במדיה המסורתית והאירוע ממוקדים לשבוע פתיחת השנה, נקודת השיא של התוכנית. את ההצלחה אני מודד בכמה מדדים פשוטים, היקף ואיכות החשיפה התקשורתית, מדדי מעורבות ברשתות כמו שיתופים, תגובות וצפיות מלאות, מספר התורמים החדשים והיקף התרומות, ולאורך זמן גם שינוי בטון של השיח סביב נוער בסיכון. מדידה שוטפת לאורך הדרך מאפשרת לתקן תוך כדי תנועה, ולא רק להסתכל אחורה בסוף.</w:t>
       </w:r>
     </w:p>
     <w:p>
@@ -1136,7 +1136,7 @@
           <w:szCs w:val="24"/>
           <w:rtl w:val="1"/>
         </w:rPr>
-        <w:t>ניהול משברים תקשורתיים היה אחד הנושאים המרכזיים בקורס, בפרק האסטרטגיות התקשורתיות בעידן הדיגיטלי, וכאן אני מיישמת אותו על מקרה קונקרטי של עמותת מרחב.</w:t>
+        <w:t>ניהול משברים תקשורתיים היה אחד הנושאים המרכזיים בקורס, בפרק האסטרטגיות התקשורתיות בעידן הדיגיטלי, וכאן אני מיישם אותו על מקרה קונקרטי של עמותת מרחב.</w:t>
       </w:r>
     </w:p>
     <w:p>
@@ -1154,7 +1154,7 @@
           <w:szCs w:val="24"/>
           <w:rtl w:val="1"/>
         </w:rPr>
-        <w:t>לעמותה שעובדת עם קטינים במצבי סיכון יש משבר קטגורי אחד שצריך להיערך אליו מראש, פגיעה באמון בעקבות אירוע חמור שמערב חניך. התרחיש שאני נערכת אליו הוא פרסום על מקרה של פגיעה, הזנחה או כשל פיקוח באחת המסגרות, שמתפוצץ בתקשורת וברשתות. משבר כזה מאיים ישירות על הנכס היקר ביותר של העמותה, האמון של הציבור ושל התורמים.</w:t>
+        <w:t>לעמותה שעובדת עם קטינים במצבי סיכון יש משבר קטגורי אחד שצריך להיערך אליו מראש, פגיעה באמון בעקבות אירוע חמור שמערב חניך. התרחיש שאני נערך אליו הוא פרסום על מקרה של פגיעה, הזנחה או כשל פיקוח באחת המסגרות, שמתפוצץ בתקשורת וברשתות. משבר כזה מאיים ישירות על הנכס היקר ביותר של העמותה, האמון של הציבור ושל התורמים.</w:t>
       </w:r>
     </w:p>
     <w:p>

</xml_diff>